<commit_message>
Labels: correct topic list, font sizes (LF 10pt, Ican 9pt), one sheet per lesson
</commit_message>
<xml_diff>
--- a/Maths/WFA_Labels_template.docx
+++ b/Maths/WFA_Labels_template.docx
@@ -109,8 +109,8 @@
                   </w:pPr>
                   <w:r>
                     <w:rPr>
-                      <w:sz w:val="22"/>
-                      <w:szCs w:val="22"/>
+                      <w:sz w:val="20"/>
+                      <w:szCs w:val="20"/>
                       <w:rFonts w:ascii="Calibri" w:cs="Calibri" w:eastAsia="Calibri" w:hAnsi="Calibri"/>
                     </w:rPr>
                     <w:t xml:space="preserve">LF: To identify which operation is required to solve a problem.</w:t>
@@ -122,8 +122,8 @@
                   </w:pPr>
                   <w:r>
                     <w:rPr>
-                      <w:sz w:val="22"/>
-                      <w:szCs w:val="22"/>
+                      <w:sz w:val="18"/>
+                      <w:szCs w:val="18"/>
                       <w:rFonts w:ascii="Calibri" w:cs="Calibri" w:eastAsia="Calibri" w:hAnsi="Calibri"/>
                     </w:rPr>
                     <w:t xml:space="preserve">I can identify the operation and clauclate using a suitable method</w:t>
@@ -135,8 +135,8 @@
                   </w:pPr>
                   <w:r>
                     <w:rPr>
-                      <w:sz w:val="22"/>
-                      <w:szCs w:val="22"/>
+                      <w:sz w:val="18"/>
+                      <w:szCs w:val="18"/>
                       <w:rFonts w:ascii="Calibri" w:cs="Calibri" w:eastAsia="Calibri" w:hAnsi="Calibri"/>
                     </w:rPr>
                     <w:t xml:space="preserve">I can solve problems involving the four operations</w:t>
@@ -329,8 +329,8 @@
                   </w:pPr>
                   <w:r>
                     <w:rPr>
-                      <w:sz w:val="22"/>
-                      <w:szCs w:val="22"/>
+                      <w:sz w:val="20"/>
+                      <w:szCs w:val="20"/>
                       <w:rFonts w:ascii="Calibri" w:cs="Calibri" w:eastAsia="Calibri" w:hAnsi="Calibri"/>
                     </w:rPr>
                     <w:t xml:space="preserve">LF: To identify which operation is required to solve a problem.</w:t>
@@ -342,8 +342,8 @@
                   </w:pPr>
                   <w:r>
                     <w:rPr>
-                      <w:sz w:val="22"/>
-                      <w:szCs w:val="22"/>
+                      <w:sz w:val="18"/>
+                      <w:szCs w:val="18"/>
                       <w:rFonts w:ascii="Calibri" w:cs="Calibri" w:eastAsia="Calibri" w:hAnsi="Calibri"/>
                     </w:rPr>
                     <w:t xml:space="preserve">I can identify the operation and clauclate using a suitable method</w:t>
@@ -355,8 +355,8 @@
                   </w:pPr>
                   <w:r>
                     <w:rPr>
-                      <w:sz w:val="22"/>
-                      <w:szCs w:val="22"/>
+                      <w:sz w:val="18"/>
+                      <w:szCs w:val="18"/>
                       <w:rFonts w:ascii="Calibri" w:cs="Calibri" w:eastAsia="Calibri" w:hAnsi="Calibri"/>
                     </w:rPr>
                     <w:t xml:space="preserve">I can solve problems involving the four operations</w:t>
@@ -536,8 +536,8 @@
                   </w:pPr>
                   <w:r>
                     <w:rPr>
-                      <w:sz w:val="22"/>
-                      <w:szCs w:val="22"/>
+                      <w:sz w:val="20"/>
+                      <w:szCs w:val="20"/>
                       <w:rFonts w:ascii="Calibri" w:cs="Calibri" w:eastAsia="Calibri" w:hAnsi="Calibri"/>
                     </w:rPr>
                     <w:t xml:space="preserve">LF: To identify which operation is required to solve a problem.</w:t>
@@ -549,8 +549,8 @@
                   </w:pPr>
                   <w:r>
                     <w:rPr>
-                      <w:sz w:val="22"/>
-                      <w:szCs w:val="22"/>
+                      <w:sz w:val="18"/>
+                      <w:szCs w:val="18"/>
                       <w:rFonts w:ascii="Calibri" w:cs="Calibri" w:eastAsia="Calibri" w:hAnsi="Calibri"/>
                     </w:rPr>
                     <w:t xml:space="preserve">I can identify the operation and clauclate using a suitable method</w:t>
@@ -562,8 +562,8 @@
                   </w:pPr>
                   <w:r>
                     <w:rPr>
-                      <w:sz w:val="22"/>
-                      <w:szCs w:val="22"/>
+                      <w:sz w:val="18"/>
+                      <w:szCs w:val="18"/>
                       <w:rFonts w:ascii="Calibri" w:cs="Calibri" w:eastAsia="Calibri" w:hAnsi="Calibri"/>
                     </w:rPr>
                     <w:t xml:space="preserve">I can solve problems involving the four operations</w:t>
@@ -756,8 +756,8 @@
                   </w:pPr>
                   <w:r>
                     <w:rPr>
-                      <w:sz w:val="22"/>
-                      <w:szCs w:val="22"/>
+                      <w:sz w:val="20"/>
+                      <w:szCs w:val="20"/>
                       <w:rFonts w:ascii="Calibri" w:cs="Calibri" w:eastAsia="Calibri" w:hAnsi="Calibri"/>
                     </w:rPr>
                     <w:t xml:space="preserve">LF: To identify which operation is required to solve a problem.</w:t>
@@ -769,8 +769,8 @@
                   </w:pPr>
                   <w:r>
                     <w:rPr>
-                      <w:sz w:val="22"/>
-                      <w:szCs w:val="22"/>
+                      <w:sz w:val="18"/>
+                      <w:szCs w:val="18"/>
                       <w:rFonts w:ascii="Calibri" w:cs="Calibri" w:eastAsia="Calibri" w:hAnsi="Calibri"/>
                     </w:rPr>
                     <w:t xml:space="preserve">I can identify the operation and clauclate using a suitable method</w:t>
@@ -782,8 +782,8 @@
                   </w:pPr>
                   <w:r>
                     <w:rPr>
-                      <w:sz w:val="22"/>
-                      <w:szCs w:val="22"/>
+                      <w:sz w:val="18"/>
+                      <w:szCs w:val="18"/>
                       <w:rFonts w:ascii="Calibri" w:cs="Calibri" w:eastAsia="Calibri" w:hAnsi="Calibri"/>
                     </w:rPr>
                     <w:t xml:space="preserve">I can solve problems involving the four operations</w:t>
@@ -963,8 +963,8 @@
                   </w:pPr>
                   <w:r>
                     <w:rPr>
-                      <w:sz w:val="22"/>
-                      <w:szCs w:val="22"/>
+                      <w:sz w:val="20"/>
+                      <w:szCs w:val="20"/>
                       <w:rFonts w:ascii="Calibri" w:cs="Calibri" w:eastAsia="Calibri" w:hAnsi="Calibri"/>
                     </w:rPr>
                     <w:t xml:space="preserve">LF: To identify which operation is required to solve a problem.</w:t>
@@ -976,8 +976,8 @@
                   </w:pPr>
                   <w:r>
                     <w:rPr>
-                      <w:sz w:val="22"/>
-                      <w:szCs w:val="22"/>
+                      <w:sz w:val="18"/>
+                      <w:szCs w:val="18"/>
                       <w:rFonts w:ascii="Calibri" w:cs="Calibri" w:eastAsia="Calibri" w:hAnsi="Calibri"/>
                     </w:rPr>
                     <w:t xml:space="preserve">I can identify the operation and clauclate using a suitable method</w:t>
@@ -989,8 +989,8 @@
                   </w:pPr>
                   <w:r>
                     <w:rPr>
-                      <w:sz w:val="22"/>
-                      <w:szCs w:val="22"/>
+                      <w:sz w:val="18"/>
+                      <w:szCs w:val="18"/>
                       <w:rFonts w:ascii="Calibri" w:cs="Calibri" w:eastAsia="Calibri" w:hAnsi="Calibri"/>
                     </w:rPr>
                     <w:t xml:space="preserve">I can solve problems involving the four operations</w:t>
@@ -1183,8 +1183,8 @@
                   </w:pPr>
                   <w:r>
                     <w:rPr>
-                      <w:sz w:val="22"/>
-                      <w:szCs w:val="22"/>
+                      <w:sz w:val="20"/>
+                      <w:szCs w:val="20"/>
                       <w:rFonts w:ascii="Calibri" w:cs="Calibri" w:eastAsia="Calibri" w:hAnsi="Calibri"/>
                     </w:rPr>
                     <w:t xml:space="preserve">LF: To identify which operation is required to solve a problem.</w:t>
@@ -1196,8 +1196,8 @@
                   </w:pPr>
                   <w:r>
                     <w:rPr>
-                      <w:sz w:val="22"/>
-                      <w:szCs w:val="22"/>
+                      <w:sz w:val="18"/>
+                      <w:szCs w:val="18"/>
                       <w:rFonts w:ascii="Calibri" w:cs="Calibri" w:eastAsia="Calibri" w:hAnsi="Calibri"/>
                     </w:rPr>
                     <w:t xml:space="preserve">I can identify the operation and clauclate using a suitable method</w:t>
@@ -1209,8 +1209,8 @@
                   </w:pPr>
                   <w:r>
                     <w:rPr>
-                      <w:sz w:val="22"/>
-                      <w:szCs w:val="22"/>
+                      <w:sz w:val="18"/>
+                      <w:szCs w:val="18"/>
                       <w:rFonts w:ascii="Calibri" w:cs="Calibri" w:eastAsia="Calibri" w:hAnsi="Calibri"/>
                     </w:rPr>
                     <w:t xml:space="preserve">I can solve problems involving the four operations</w:t>
@@ -1390,8 +1390,8 @@
                   </w:pPr>
                   <w:r>
                     <w:rPr>
-                      <w:sz w:val="22"/>
-                      <w:szCs w:val="22"/>
+                      <w:sz w:val="20"/>
+                      <w:szCs w:val="20"/>
                       <w:rFonts w:ascii="Calibri" w:cs="Calibri" w:eastAsia="Calibri" w:hAnsi="Calibri"/>
                     </w:rPr>
                     <w:t xml:space="preserve">LF: To identify which operation is required to solve a problem.</w:t>
@@ -1403,8 +1403,8 @@
                   </w:pPr>
                   <w:r>
                     <w:rPr>
-                      <w:sz w:val="22"/>
-                      <w:szCs w:val="22"/>
+                      <w:sz w:val="18"/>
+                      <w:szCs w:val="18"/>
                       <w:rFonts w:ascii="Calibri" w:cs="Calibri" w:eastAsia="Calibri" w:hAnsi="Calibri"/>
                     </w:rPr>
                     <w:t xml:space="preserve">I can identify the operation and clauclate using a suitable method</w:t>
@@ -1416,8 +1416,8 @@
                   </w:pPr>
                   <w:r>
                     <w:rPr>
-                      <w:sz w:val="22"/>
-                      <w:szCs w:val="22"/>
+                      <w:sz w:val="18"/>
+                      <w:szCs w:val="18"/>
                       <w:rFonts w:ascii="Calibri" w:cs="Calibri" w:eastAsia="Calibri" w:hAnsi="Calibri"/>
                     </w:rPr>
                     <w:t xml:space="preserve">I can solve problems involving the four operations</w:t>
@@ -1610,8 +1610,8 @@
                   </w:pPr>
                   <w:r>
                     <w:rPr>
-                      <w:sz w:val="22"/>
-                      <w:szCs w:val="22"/>
+                      <w:sz w:val="20"/>
+                      <w:szCs w:val="20"/>
                       <w:rFonts w:ascii="Calibri" w:cs="Calibri" w:eastAsia="Calibri" w:hAnsi="Calibri"/>
                     </w:rPr>
                     <w:t xml:space="preserve">LF: To identify which operation is required to solve a problem.</w:t>
@@ -1623,8 +1623,8 @@
                   </w:pPr>
                   <w:r>
                     <w:rPr>
-                      <w:sz w:val="22"/>
-                      <w:szCs w:val="22"/>
+                      <w:sz w:val="18"/>
+                      <w:szCs w:val="18"/>
                       <w:rFonts w:ascii="Calibri" w:cs="Calibri" w:eastAsia="Calibri" w:hAnsi="Calibri"/>
                     </w:rPr>
                     <w:t xml:space="preserve">I can identify the operation and clauclate using a suitable method</w:t>
@@ -1636,8 +1636,8 @@
                   </w:pPr>
                   <w:r>
                     <w:rPr>
-                      <w:sz w:val="22"/>
-                      <w:szCs w:val="22"/>
+                      <w:sz w:val="18"/>
+                      <w:szCs w:val="18"/>
                       <w:rFonts w:ascii="Calibri" w:cs="Calibri" w:eastAsia="Calibri" w:hAnsi="Calibri"/>
                     </w:rPr>
                     <w:t xml:space="preserve">I can solve problems involving the four operations</w:t>
@@ -1817,8 +1817,8 @@
                   </w:pPr>
                   <w:r>
                     <w:rPr>
-                      <w:sz w:val="22"/>
-                      <w:szCs w:val="22"/>
+                      <w:sz w:val="20"/>
+                      <w:szCs w:val="20"/>
                       <w:rFonts w:ascii="Calibri" w:cs="Calibri" w:eastAsia="Calibri" w:hAnsi="Calibri"/>
                     </w:rPr>
                     <w:t xml:space="preserve">LF: To identify which operation is required to solve a problem.</w:t>
@@ -1830,8 +1830,8 @@
                   </w:pPr>
                   <w:r>
                     <w:rPr>
-                      <w:sz w:val="22"/>
-                      <w:szCs w:val="22"/>
+                      <w:sz w:val="18"/>
+                      <w:szCs w:val="18"/>
                       <w:rFonts w:ascii="Calibri" w:cs="Calibri" w:eastAsia="Calibri" w:hAnsi="Calibri"/>
                     </w:rPr>
                     <w:t xml:space="preserve">I can identify the operation and clauclate using a suitable method</w:t>
@@ -1843,8 +1843,8 @@
                   </w:pPr>
                   <w:r>
                     <w:rPr>
-                      <w:sz w:val="22"/>
-                      <w:szCs w:val="22"/>
+                      <w:sz w:val="18"/>
+                      <w:szCs w:val="18"/>
                       <w:rFonts w:ascii="Calibri" w:cs="Calibri" w:eastAsia="Calibri" w:hAnsi="Calibri"/>
                     </w:rPr>
                     <w:t xml:space="preserve">I can solve problems involving the four operations</w:t>
@@ -2037,8 +2037,8 @@
                   </w:pPr>
                   <w:r>
                     <w:rPr>
-                      <w:sz w:val="22"/>
-                      <w:szCs w:val="22"/>
+                      <w:sz w:val="20"/>
+                      <w:szCs w:val="20"/>
                       <w:rFonts w:ascii="Calibri" w:cs="Calibri" w:eastAsia="Calibri" w:hAnsi="Calibri"/>
                     </w:rPr>
                     <w:t xml:space="preserve">LF: To identify which operation is required to solve a problem.</w:t>
@@ -2050,8 +2050,8 @@
                   </w:pPr>
                   <w:r>
                     <w:rPr>
-                      <w:sz w:val="22"/>
-                      <w:szCs w:val="22"/>
+                      <w:sz w:val="18"/>
+                      <w:szCs w:val="18"/>
                       <w:rFonts w:ascii="Calibri" w:cs="Calibri" w:eastAsia="Calibri" w:hAnsi="Calibri"/>
                     </w:rPr>
                     <w:t xml:space="preserve">I can identify the operation and clauclate using a suitable method</w:t>
@@ -2063,8 +2063,8 @@
                   </w:pPr>
                   <w:r>
                     <w:rPr>
-                      <w:sz w:val="22"/>
-                      <w:szCs w:val="22"/>
+                      <w:sz w:val="18"/>
+                      <w:szCs w:val="18"/>
                       <w:rFonts w:ascii="Calibri" w:cs="Calibri" w:eastAsia="Calibri" w:hAnsi="Calibri"/>
                     </w:rPr>
                     <w:t xml:space="preserve">I can solve problems involving the four operations</w:t>
@@ -2244,8 +2244,8 @@
                   </w:pPr>
                   <w:r>
                     <w:rPr>
-                      <w:sz w:val="22"/>
-                      <w:szCs w:val="22"/>
+                      <w:sz w:val="20"/>
+                      <w:szCs w:val="20"/>
                       <w:rFonts w:ascii="Calibri" w:cs="Calibri" w:eastAsia="Calibri" w:hAnsi="Calibri"/>
                     </w:rPr>
                     <w:t xml:space="preserve">LF: To identify which operation is required to solve a problem.</w:t>
@@ -2257,8 +2257,8 @@
                   </w:pPr>
                   <w:r>
                     <w:rPr>
-                      <w:sz w:val="22"/>
-                      <w:szCs w:val="22"/>
+                      <w:sz w:val="18"/>
+                      <w:szCs w:val="18"/>
                       <w:rFonts w:ascii="Calibri" w:cs="Calibri" w:eastAsia="Calibri" w:hAnsi="Calibri"/>
                     </w:rPr>
                     <w:t xml:space="preserve">I can identify the operation and clauclate using a suitable method</w:t>
@@ -2270,8 +2270,8 @@
                   </w:pPr>
                   <w:r>
                     <w:rPr>
-                      <w:sz w:val="22"/>
-                      <w:szCs w:val="22"/>
+                      <w:sz w:val="18"/>
+                      <w:szCs w:val="18"/>
                       <w:rFonts w:ascii="Calibri" w:cs="Calibri" w:eastAsia="Calibri" w:hAnsi="Calibri"/>
                     </w:rPr>
                     <w:t xml:space="preserve">I can solve problems involving the four operations</w:t>
@@ -2464,8 +2464,8 @@
                   </w:pPr>
                   <w:r>
                     <w:rPr>
-                      <w:sz w:val="22"/>
-                      <w:szCs w:val="22"/>
+                      <w:sz w:val="20"/>
+                      <w:szCs w:val="20"/>
                       <w:rFonts w:ascii="Calibri" w:cs="Calibri" w:eastAsia="Calibri" w:hAnsi="Calibri"/>
                     </w:rPr>
                     <w:t xml:space="preserve">LF: To identify which operation is required to solve a problem.</w:t>
@@ -2477,8 +2477,8 @@
                   </w:pPr>
                   <w:r>
                     <w:rPr>
-                      <w:sz w:val="22"/>
-                      <w:szCs w:val="22"/>
+                      <w:sz w:val="18"/>
+                      <w:szCs w:val="18"/>
                       <w:rFonts w:ascii="Calibri" w:cs="Calibri" w:eastAsia="Calibri" w:hAnsi="Calibri"/>
                     </w:rPr>
                     <w:t xml:space="preserve">I can identify the operation and clauclate using a suitable method</w:t>
@@ -2490,8 +2490,8 @@
                   </w:pPr>
                   <w:r>
                     <w:rPr>
-                      <w:sz w:val="22"/>
-                      <w:szCs w:val="22"/>
+                      <w:sz w:val="18"/>
+                      <w:szCs w:val="18"/>
                       <w:rFonts w:ascii="Calibri" w:cs="Calibri" w:eastAsia="Calibri" w:hAnsi="Calibri"/>
                     </w:rPr>
                     <w:t xml:space="preserve">I can solve problems involving the four operations</w:t>

</xml_diff>